<commit_message>
Add Upstash error logging to infrastructure page
</commit_message>
<xml_diff>
--- a/docs/alwaysready-api-key-rotation-log.docx
+++ b/docs/alwaysready-api-key-rotation-log.docx
@@ -1754,6 +1754,262 @@
                 <w:szCs w:val="18"/>
               </w:rPr>
               <w:t xml:space="preserve"/>
+            </w:r>
+          </w:p>
+        </w:tc>
+      </w:tr>
+      <w:tr>
+        <w:tc>
+          <w:tcPr>
+            <w:tcW w:type="dxa" w:w="1800"/>
+            <w:shd w:fill="F0F7F7" w:color="auto" w:val="clear"/>
+            <w:vAlign w:val="center"/>
+          </w:tcPr>
+          <w:p>
+            <w:pPr>
+              <w:jc w:val="left"/>
+            </w:pPr>
+            <w:r>
+              <w:rPr>
+                <w:rFonts w:ascii="Calibri" w:cs="Calibri" w:eastAsia="Calibri" w:hAnsi="Calibri"/>
+                <w:color w:val="1A1A1A"/>
+                <w:sz w:val="18"/>
+                <w:szCs w:val="18"/>
+              </w:rPr>
+              <w:t xml:space="preserve">UPSTASH_MANAGEMENT_API_KEY</w:t>
+            </w:r>
+          </w:p>
+        </w:tc>
+        <w:tc>
+          <w:tcPr>
+            <w:tcW w:type="dxa" w:w="1800"/>
+            <w:shd w:fill="F0F7F7" w:color="auto" w:val="clear"/>
+            <w:vAlign w:val="center"/>
+          </w:tcPr>
+          <w:p>
+            <w:pPr>
+              <w:jc w:val="left"/>
+            </w:pPr>
+            <w:r>
+              <w:rPr>
+                <w:rFonts w:ascii="Calibri" w:cs="Calibri" w:eastAsia="Calibri" w:hAnsi="Calibri"/>
+                <w:color w:val="1A1A1A"/>
+                <w:sz w:val="18"/>
+                <w:szCs w:val="18"/>
+              </w:rPr>
+              <w:t xml:space="preserve">Upstash</w:t>
+            </w:r>
+          </w:p>
+        </w:tc>
+        <w:tc>
+          <w:tcPr>
+            <w:tcW w:type="dxa" w:w="1500"/>
+            <w:shd w:fill="F0F7F7" w:color="auto" w:val="clear"/>
+            <w:vAlign w:val="center"/>
+          </w:tcPr>
+          <w:p>
+            <w:pPr>
+              <w:jc w:val="left"/>
+            </w:pPr>
+            <w:r>
+              <w:rPr>
+                <w:rFonts w:ascii="Calibri" w:cs="Calibri" w:eastAsia="Calibri" w:hAnsi="Calibri"/>
+                <w:color w:val="1A1A1A"/>
+                <w:sz w:val="18"/>
+                <w:szCs w:val="18"/>
+              </w:rPr>
+              <w:t xml:space="preserve">console.upstash.com → Personal Settings → Developer API → delete old key → create new</w:t>
+            </w:r>
+          </w:p>
+        </w:tc>
+        <w:tc>
+          <w:tcPr>
+            <w:tcW w:type="dxa" w:w="1260"/>
+            <w:shd w:fill="F0F7F7" w:color="auto" w:val="clear"/>
+            <w:vAlign w:val="center"/>
+          </w:tcPr>
+          <w:p>
+            <w:pPr>
+              <w:jc w:val="left"/>
+            </w:pPr>
+            <w:r>
+              <w:rPr>
+                <w:rFonts w:ascii="Calibri" w:cs="Calibri" w:eastAsia="Calibri" w:hAnsi="Calibri"/>
+                <w:color w:val="1A1A1A"/>
+                <w:sz w:val="18"/>
+                <w:szCs w:val="18"/>
+              </w:rPr>
+              <w:t xml:space="preserve">12 months</w:t>
+            </w:r>
+          </w:p>
+        </w:tc>
+        <w:tc>
+          <w:tcPr>
+            <w:tcW w:type="dxa" w:w="1500"/>
+            <w:shd w:fill="F0F7F7" w:color="auto" w:val="clear"/>
+            <w:vAlign w:val="center"/>
+          </w:tcPr>
+          <w:p>
+            <w:pPr>
+              <w:jc w:val="left"/>
+            </w:pPr>
+            <w:r>
+              <w:rPr>
+                <w:rFonts w:ascii="Calibri" w:cs="Calibri" w:eastAsia="Calibri" w:hAnsi="Calibri"/>
+                <w:color w:val="1A1A1A"/>
+                <w:sz w:val="18"/>
+                <w:szCs w:val="18"/>
+              </w:rPr>
+              <w:t xml:space="preserve">3 Sep 2026</w:t>
+            </w:r>
+          </w:p>
+        </w:tc>
+        <w:tc>
+          <w:tcPr>
+            <w:tcW w:type="dxa" w:w="1500"/>
+            <w:shd w:fill="F0F7F7" w:color="auto" w:val="clear"/>
+            <w:vAlign w:val="center"/>
+          </w:tcPr>
+          <w:p>
+            <w:pPr>
+              <w:jc w:val="left"/>
+            </w:pPr>
+            <w:r>
+              <w:rPr>
+                <w:rFonts w:ascii="Calibri" w:cs="Calibri" w:eastAsia="Calibri" w:hAnsi="Calibri"/>
+                <w:color w:val="1A1A1A"/>
+                <w:sz w:val="18"/>
+                <w:szCs w:val="18"/>
+              </w:rPr>
+              <w:t xml:space="preserve">3 Sep 2027</w:t>
+            </w:r>
+          </w:p>
+        </w:tc>
+      </w:tr>
+      <w:tr>
+        <w:tc>
+          <w:tcPr>
+            <w:tcW w:type="dxa" w:w="1800"/>
+            <w:shd w:fill="FFFFFF" w:color="auto" w:val="clear"/>
+            <w:vAlign w:val="center"/>
+          </w:tcPr>
+          <w:p>
+            <w:pPr>
+              <w:jc w:val="left"/>
+            </w:pPr>
+            <w:r>
+              <w:rPr>
+                <w:rFonts w:ascii="Calibri" w:cs="Calibri" w:eastAsia="Calibri" w:hAnsi="Calibri"/>
+                <w:color w:val="1A1A1A"/>
+                <w:sz w:val="18"/>
+                <w:szCs w:val="18"/>
+              </w:rPr>
+              <w:t xml:space="preserve">CLOUDFLARE_API_TOKEN</w:t>
+            </w:r>
+          </w:p>
+        </w:tc>
+        <w:tc>
+          <w:tcPr>
+            <w:tcW w:type="dxa" w:w="1800"/>
+            <w:shd w:fill="FFFFFF" w:color="auto" w:val="clear"/>
+            <w:vAlign w:val="center"/>
+          </w:tcPr>
+          <w:p>
+            <w:pPr>
+              <w:jc w:val="left"/>
+            </w:pPr>
+            <w:r>
+              <w:rPr>
+                <w:rFonts w:ascii="Calibri" w:cs="Calibri" w:eastAsia="Calibri" w:hAnsi="Calibri"/>
+                <w:color w:val="1A1A1A"/>
+                <w:sz w:val="18"/>
+                <w:szCs w:val="18"/>
+              </w:rPr>
+              <w:t xml:space="preserve">Cloudflare</w:t>
+            </w:r>
+          </w:p>
+        </w:tc>
+        <w:tc>
+          <w:tcPr>
+            <w:tcW w:type="dxa" w:w="1500"/>
+            <w:shd w:fill="FFFFFF" w:color="auto" w:val="clear"/>
+            <w:vAlign w:val="center"/>
+          </w:tcPr>
+          <w:p>
+            <w:pPr>
+              <w:jc w:val="left"/>
+            </w:pPr>
+            <w:r>
+              <w:rPr>
+                <w:rFonts w:ascii="Calibri" w:cs="Calibri" w:eastAsia="Calibri" w:hAnsi="Calibri"/>
+                <w:color w:val="1A1A1A"/>
+                <w:sz w:val="18"/>
+                <w:szCs w:val="18"/>
+              </w:rPr>
+              <w:t xml:space="preserve">dash.cloudflare.com → My Profile → API Tokens → delete old → Create Token (Read analytics and logs template)</w:t>
+            </w:r>
+          </w:p>
+        </w:tc>
+        <w:tc>
+          <w:tcPr>
+            <w:tcW w:type="dxa" w:w="1260"/>
+            <w:shd w:fill="FFFFFF" w:color="auto" w:val="clear"/>
+            <w:vAlign w:val="center"/>
+          </w:tcPr>
+          <w:p>
+            <w:pPr>
+              <w:jc w:val="left"/>
+            </w:pPr>
+            <w:r>
+              <w:rPr>
+                <w:rFonts w:ascii="Calibri" w:cs="Calibri" w:eastAsia="Calibri" w:hAnsi="Calibri"/>
+                <w:color w:val="1A1A1A"/>
+                <w:sz w:val="18"/>
+                <w:szCs w:val="18"/>
+              </w:rPr>
+              <w:t xml:space="preserve">12 months</w:t>
+            </w:r>
+          </w:p>
+        </w:tc>
+        <w:tc>
+          <w:tcPr>
+            <w:tcW w:type="dxa" w:w="1500"/>
+            <w:shd w:fill="FFFFFF" w:color="auto" w:val="clear"/>
+            <w:vAlign w:val="center"/>
+          </w:tcPr>
+          <w:p>
+            <w:pPr>
+              <w:jc w:val="left"/>
+            </w:pPr>
+            <w:r>
+              <w:rPr>
+                <w:rFonts w:ascii="Calibri" w:cs="Calibri" w:eastAsia="Calibri" w:hAnsi="Calibri"/>
+                <w:color w:val="1A1A1A"/>
+                <w:sz w:val="18"/>
+                <w:szCs w:val="18"/>
+              </w:rPr>
+              <w:t xml:space="preserve">3 Sep 2026</w:t>
+            </w:r>
+          </w:p>
+        </w:tc>
+        <w:tc>
+          <w:tcPr>
+            <w:tcW w:type="dxa" w:w="1500"/>
+            <w:shd w:fill="FFFFFF" w:color="auto" w:val="clear"/>
+            <w:vAlign w:val="center"/>
+          </w:tcPr>
+          <w:p>
+            <w:pPr>
+              <w:jc w:val="left"/>
+            </w:pPr>
+            <w:r>
+              <w:rPr>
+                <w:rFonts w:ascii="Calibri" w:cs="Calibri" w:eastAsia="Calibri" w:hAnsi="Calibri"/>
+                <w:color w:val="1A1A1A"/>
+                <w:sz w:val="18"/>
+                <w:szCs w:val="18"/>
+              </w:rPr>
+              <w:t xml:space="preserve">4 Sep 2027</w:t>
             </w:r>
           </w:p>
         </w:tc>

</xml_diff>